<commit_message>
docs(sena): incorporar firma digital del candidato y diagramas de alta resolucion verificados
</commit_message>
<xml_diff>
--- a/documents/FORMATO DE PRODUCTO_NORMA 220501095 _ Manga Arias - Breyner De Jesus.docx
+++ b/documents/FORMATO DE PRODUCTO_NORMA 220501095 _ Manga Arias - Breyner De Jesus.docx
@@ -94,8 +94,22 @@
             <w:vAlign w:val="center"/>
           </w:tcPr>
           <w:p>
-            <w:r>
-              <w:t>NOMBRES Y APELLIDOS DEL CANDIDATO: Breyner De Jesus Manga Arias</w:t>
+            <w:r/>
+            <w:r>
+              <w:rPr>
+                <w:rFonts w:ascii="Arial" w:hAnsi="Arial"/>
+                <w:b/>
+                <w:sz w:val="20"/>
+              </w:rPr>
+              <w:t xml:space="preserve">NOMBRES Y APELLIDOS DEL CANDIDATO: </w:t>
+            </w:r>
+            <w:r>
+              <w:rPr>
+                <w:rFonts w:ascii="Arial" w:hAnsi="Arial"/>
+                <w:b/>
+                <w:sz w:val="20"/>
+              </w:rPr>
+              <w:t>Breyner De Jesus Manga Arias</w:t>
             </w:r>
           </w:p>
         </w:tc>
@@ -110,8 +124,22 @@
             <w:vAlign w:val="center"/>
           </w:tcPr>
           <w:p>
-            <w:r>
-              <w:t>DOCUMENTO: 1043668249</w:t>
+            <w:r/>
+            <w:r>
+              <w:rPr>
+                <w:rFonts w:ascii="Arial" w:hAnsi="Arial"/>
+                <w:b/>
+                <w:sz w:val="20"/>
+              </w:rPr>
+              <w:t xml:space="preserve">DOCUMENTO: </w:t>
+            </w:r>
+            <w:r>
+              <w:rPr>
+                <w:rFonts w:ascii="Arial" w:hAnsi="Arial"/>
+                <w:b w:val="0"/>
+                <w:sz w:val="20"/>
+              </w:rPr>
+              <w:t>1043668249</w:t>
             </w:r>
           </w:p>
         </w:tc>
@@ -211,8 +239,22 @@
             <w:vAlign w:val="center"/>
           </w:tcPr>
           <w:p>
-            <w:r>
-              <w:t>FECHA DE ENTREGA: 6 de septiembre de 2026</w:t>
+            <w:r/>
+            <w:r>
+              <w:rPr>
+                <w:rFonts w:ascii="Arial" w:hAnsi="Arial"/>
+                <w:b/>
+                <w:sz w:val="20"/>
+              </w:rPr>
+              <w:t xml:space="preserve">FECHA DE ENTREGA: </w:t>
+            </w:r>
+            <w:r>
+              <w:rPr>
+                <w:rFonts w:ascii="Arial" w:hAnsi="Arial"/>
+                <w:b w:val="0"/>
+                <w:sz w:val="20"/>
+              </w:rPr>
+              <w:t>6 de septiembre de 2026</w:t>
             </w:r>
           </w:p>
         </w:tc>
@@ -370,6 +412,7 @@
             </w:pPr>
             <w:r>
               <w:rPr>
+                <w:rFonts w:ascii="Arial" w:hAnsi="Arial"/>
                 <w:b/>
                 <w:color w:val="8C4614"/>
                 <w:sz w:val="20"/>
@@ -383,6 +426,7 @@
             </w:pPr>
             <w:r>
               <w:rPr>
+                <w:rFonts w:ascii="Arial" w:hAnsi="Arial"/>
                 <w:color w:val="1E1E1E"/>
                 <w:sz w:val="18"/>
               </w:rPr>
@@ -395,6 +439,7 @@
             </w:pPr>
             <w:r>
               <w:rPr>
+                <w:rFonts w:ascii="Arial" w:hAnsi="Arial"/>
                 <w:b/>
                 <w:color w:val="8C4614"/>
                 <w:sz w:val="20"/>
@@ -408,6 +453,7 @@
             </w:pPr>
             <w:r>
               <w:rPr>
+                <w:rFonts w:ascii="Arial" w:hAnsi="Arial"/>
                 <w:sz w:val="18"/>
               </w:rPr>
               <w:t>•  Estudiantes y Prospectos: Reciben información académica inmediata, veraz y fundamentada en documentos oficiales 24/7.</w:t>
@@ -419,6 +465,7 @@
             </w:pPr>
             <w:r>
               <w:rPr>
+                <w:rFonts w:ascii="Arial" w:hAnsi="Arial"/>
                 <w:sz w:val="18"/>
               </w:rPr>
               <w:t>•  Asesores de Admisiones: Disponen de una consola en tiempo real para tomar el control de casos complejos y gestionar prospectos calificados.</w:t>
@@ -430,6 +477,7 @@
             </w:pPr>
             <w:r>
               <w:rPr>
+                <w:rFonts w:ascii="Arial" w:hAnsi="Arial"/>
                 <w:sz w:val="18"/>
               </w:rPr>
               <w:t>•  Supervisores y Coordinadores: Monitorean en vivo el cumplimiento de acuerdos de nivel de servicio (SLA), costos y satisfacción (CSAT).</w:t>
@@ -441,6 +489,7 @@
             </w:pPr>
             <w:r>
               <w:rPr>
+                <w:rFonts w:ascii="Arial" w:hAnsi="Arial"/>
                 <w:b/>
                 <w:color w:val="8C4614"/>
                 <w:sz w:val="20"/>
@@ -454,6 +503,7 @@
             </w:pPr>
             <w:r>
               <w:rPr>
+                <w:rFonts w:ascii="Arial" w:hAnsi="Arial"/>
                 <w:sz w:val="18"/>
               </w:rPr>
               <w:t>•  Eliminación de alucinaciones: Búsqueda RAG sobre ChromaDB que garantiza respuestas basadas estrictamente en mallas y aranceles 2026.</w:t>
@@ -465,6 +515,7 @@
             </w:pPr>
             <w:r>
               <w:rPr>
+                <w:rFonts w:ascii="Arial" w:hAnsi="Arial"/>
                 <w:sz w:val="18"/>
               </w:rPr>
               <w:t>•  Cero tiempos muertos: Inferencia conversacional con Groq LPU en ~500ms y disponibilidad permanente sin sobrecargar al equipo humano.</w:t>
@@ -476,6 +527,7 @@
             </w:pPr>
             <w:r>
               <w:rPr>
+                <w:rFonts w:ascii="Arial" w:hAnsi="Arial"/>
                 <w:sz w:val="18"/>
               </w:rPr>
               <w:t>•  Escalamiento fluido: Transferencia inmediata hacia asesores humanos en WebSockets y Telegram sin perder el contexto previo de la charla.</w:t>
@@ -558,6 +610,7 @@
             </w:pPr>
             <w:r>
               <w:rPr>
+                <w:rFonts w:ascii="Arial" w:hAnsi="Arial"/>
                 <w:b/>
                 <w:color w:val="8C4614"/>
                 <w:sz w:val="20"/>
@@ -571,6 +624,7 @@
             </w:pPr>
             <w:r>
               <w:rPr>
+                <w:rFonts w:ascii="Arial" w:hAnsi="Arial"/>
                 <w:sz w:val="18"/>
               </w:rPr>
               <w:t>•  RF-01: Consultas RAG Institucionales con Groq LPU y ChromaDB.</w:t>
@@ -582,6 +636,7 @@
             </w:pPr>
             <w:r>
               <w:rPr>
+                <w:rFonts w:ascii="Arial" w:hAnsi="Arial"/>
                 <w:sz w:val="18"/>
               </w:rPr>
               <w:t>•  RF-02: Detección y Adaptación Multilingüe estricta (Español / Inglés).</w:t>
@@ -593,6 +648,7 @@
             </w:pPr>
             <w:r>
               <w:rPr>
+                <w:rFonts w:ascii="Arial" w:hAnsi="Arial"/>
                 <w:sz w:val="18"/>
               </w:rPr>
               <w:t>•  RF-03: Captura automatizada de datos de prospectos comerciales (Leads).</w:t>
@@ -604,6 +660,7 @@
             </w:pPr>
             <w:r>
               <w:rPr>
+                <w:rFonts w:ascii="Arial" w:hAnsi="Arial"/>
                 <w:sz w:val="18"/>
               </w:rPr>
               <w:t>•  RF-04: Escalamiento Asistido (Handoff) ante solicitudes de asesor humano.</w:t>
@@ -615,6 +672,7 @@
             </w:pPr>
             <w:r>
               <w:rPr>
+                <w:rFonts w:ascii="Arial" w:hAnsi="Arial"/>
                 <w:sz w:val="18"/>
               </w:rPr>
               <w:t>•  RF-05: Chat Bidireccional en Tiempo Real vía WebSockets (/ws/chat y /ws/agent).</w:t>
@@ -626,6 +684,7 @@
             </w:pPr>
             <w:r>
               <w:rPr>
+                <w:rFonts w:ascii="Arial" w:hAnsi="Arial"/>
                 <w:sz w:val="18"/>
               </w:rPr>
               <w:t>•  RF-06: Asignación Atómica de Conversaciones (Claim) con prevención de colisiones.</w:t>
@@ -637,6 +696,7 @@
             </w:pPr>
             <w:r>
               <w:rPr>
+                <w:rFonts w:ascii="Arial" w:hAnsi="Arial"/>
                 <w:sz w:val="18"/>
               </w:rPr>
               <w:t>•  RF-07: Resolución y Cierre de Tickets con notificación a usuarios.</w:t>
@@ -648,6 +708,7 @@
             </w:pPr>
             <w:r>
               <w:rPr>
+                <w:rFonts w:ascii="Arial" w:hAnsi="Arial"/>
                 <w:sz w:val="18"/>
               </w:rPr>
               <w:t>•  RF-08: Ingesta Documental Multiformato (.pdf, .docx, .md, .txt) con reindexación vectorial.</w:t>
@@ -659,6 +720,7 @@
             </w:pPr>
             <w:r>
               <w:rPr>
+                <w:rFonts w:ascii="Arial" w:hAnsi="Arial"/>
                 <w:sz w:val="18"/>
               </w:rPr>
               <w:t>•  RF-09: Autenticación Administrativa JWT con cifrado de contraseñas Bcrypt.</w:t>
@@ -670,6 +732,7 @@
             </w:pPr>
             <w:r>
               <w:rPr>
+                <w:rFonts w:ascii="Arial" w:hAnsi="Arial"/>
                 <w:sz w:val="18"/>
               </w:rPr>
               <w:t>•  RF-10: Dashboard de Analítica y Supervisión Operacional (SLA, CSAT, costos).</w:t>
@@ -677,32 +740,11 @@
           </w:p>
           <w:p>
             <w:pPr>
-              <w:spacing w:before="30" w:after="30"/>
-            </w:pPr>
-            <w:r>
-              <w:rPr>
-                <w:sz w:val="18"/>
-              </w:rPr>
-              <w:t>•  RF-11: Bot de Telegram con teclado de acción inline interactivo.</w:t>
-            </w:r>
-          </w:p>
-          <w:p>
-            <w:pPr>
-              <w:spacing w:before="30" w:after="30"/>
-            </w:pPr>
-            <w:r>
-              <w:rPr>
-                <w:sz w:val="18"/>
-              </w:rPr>
-              <w:t>•  RF-12: Auto-limpieza en segundo plano de sesiones inactivas tras 30 minutos.</w:t>
-            </w:r>
-          </w:p>
-          <w:p>
-            <w:pPr>
               <w:spacing w:before="160" w:after="60"/>
             </w:pPr>
             <w:r>
               <w:rPr>
+                <w:rFonts w:ascii="Arial" w:hAnsi="Arial"/>
                 <w:b/>
                 <w:color w:val="8C4614"/>
                 <w:sz w:val="20"/>
@@ -716,17 +758,19 @@
             </w:pPr>
             <w:r>
               <w:rPr>
-                <w:sz w:val="18"/>
-              </w:rPr>
-              <w:t>•  RNF-01 (Rendimiento): Inferencia LLM inferior a 1.2s y respuestas en caché en &lt;50ms.</w:t>
-            </w:r>
-          </w:p>
-          <w:p>
-            <w:pPr>
-              <w:spacing w:before="30" w:after="30"/>
-            </w:pPr>
-            <w:r>
-              <w:rPr>
+                <w:rFonts w:ascii="Arial" w:hAnsi="Arial"/>
+                <w:sz w:val="18"/>
+              </w:rPr>
+              <w:t>•  RNF-01 (Rendimiento): Inferencia LLM inferior a 1.2s y respuestas en caché &lt;50ms.</w:t>
+            </w:r>
+          </w:p>
+          <w:p>
+            <w:pPr>
+              <w:spacing w:before="30" w:after="30"/>
+            </w:pPr>
+            <w:r>
+              <w:rPr>
+                <w:rFonts w:ascii="Arial" w:hAnsi="Arial"/>
                 <w:sz w:val="18"/>
               </w:rPr>
               <w:t>•  RNF-02 (Seguridad): 4 capas defensivas (Rate Limit SlowAPI, JWT, Guardrails NFKD, PII).</w:t>
@@ -738,6 +782,7 @@
             </w:pPr>
             <w:r>
               <w:rPr>
+                <w:rFonts w:ascii="Arial" w:hAnsi="Arial"/>
                 <w:sz w:val="18"/>
               </w:rPr>
               <w:t>•  RNF-03 (Concurrencia): Arquitectura asíncrona no bloqueante (FastAPI + asyncio).</w:t>
@@ -749,6 +794,7 @@
             </w:pPr>
             <w:r>
               <w:rPr>
+                <w:rFonts w:ascii="Arial" w:hAnsi="Arial"/>
                 <w:sz w:val="18"/>
               </w:rPr>
               <w:t>•  RNF-04 (Usabilidad): Interfaz responsiva moderna con React 18 y Tailwind CSS v4.</w:t>
@@ -760,6 +806,7 @@
             </w:pPr>
             <w:r>
               <w:rPr>
+                <w:rFonts w:ascii="Arial" w:hAnsi="Arial"/>
                 <w:sz w:val="18"/>
               </w:rPr>
               <w:t>•  RNF-05 (Persistencia): Soporte desacoplado para SQLite y PostgreSQL con SQLAlchemy 2.0.</w:t>
@@ -771,6 +818,7 @@
             </w:pPr>
             <w:r>
               <w:rPr>
+                <w:rFonts w:ascii="Arial" w:hAnsi="Arial"/>
                 <w:sz w:val="18"/>
               </w:rPr>
               <w:t>•  RNF-06 (Mantenibilidad): Suite de pruebas unitarias Pytest con 47 tests (100% aprobados).</w:t>
@@ -853,6 +901,7 @@
             </w:pPr>
             <w:r>
               <w:rPr>
+                <w:rFonts w:ascii="Arial" w:hAnsi="Arial"/>
                 <w:b/>
                 <w:color w:val="8C4614"/>
                 <w:sz w:val="20"/>
@@ -866,6 +915,7 @@
             </w:pPr>
             <w:r>
               <w:rPr>
+                <w:rFonts w:ascii="Arial" w:hAnsi="Arial"/>
                 <w:color w:val="1E1E1E"/>
                 <w:sz w:val="18"/>
               </w:rPr>
@@ -878,6 +928,7 @@
             </w:pPr>
             <w:r>
               <w:rPr>
+                <w:rFonts w:ascii="Arial" w:hAnsi="Arial"/>
                 <w:sz w:val="18"/>
               </w:rPr>
               <w:t>•  Capa de Presentación: React 18 SPA servida con Nginx, con FloatingChat y AdminDashboard.</w:t>
@@ -889,6 +940,7 @@
             </w:pPr>
             <w:r>
               <w:rPr>
+                <w:rFonts w:ascii="Arial" w:hAnsi="Arial"/>
                 <w:sz w:val="18"/>
               </w:rPr>
               <w:t>•  Capa de API y Negocio: FastAPI con routers modulares, hub de WebSockets en memoria y ciberseguridad perimetral.</w:t>
@@ -900,6 +952,7 @@
             </w:pPr>
             <w:r>
               <w:rPr>
+                <w:rFonts w:ascii="Arial" w:hAnsi="Arial"/>
                 <w:sz w:val="18"/>
               </w:rPr>
               <w:t>•  Capa de RAG e Inteligencia: Groq Cloud LPU para inferencia de lenguaje, Google Gemini para embeddings y ChromaDB embebido.</w:t>
@@ -911,6 +964,7 @@
             </w:pPr>
             <w:r>
               <w:rPr>
+                <w:rFonts w:ascii="Arial" w:hAnsi="Arial"/>
                 <w:sz w:val="18"/>
               </w:rPr>
               <w:t>•  Capa de Persistencia: SQLAlchemy 2.0 ORM gestionando modelos relacionales en SQLite/Postgres y ResponseCache en memoria.</w:t>
@@ -922,6 +976,7 @@
             </w:pPr>
             <w:r>
               <w:rPr>
+                <w:rFonts w:ascii="Arial" w:hAnsi="Arial"/>
                 <w:sz w:val="18"/>
               </w:rPr>
               <w:t>•  Capa de Automatización: Motor n8n enrutando webhooks hacia la API de Telegram Bot.</w:t>
@@ -935,8 +990,8 @@
             <w:r>
               <w:drawing>
                 <wp:inline xmlns:a="http://schemas.openxmlformats.org/drawingml/2006/main" xmlns:pic="http://schemas.openxmlformats.org/drawingml/2006/picture">
-                  <wp:extent cx="4754880" cy="1093622"/>
-                  <wp:docPr id="1" name="Picture 1"/>
+                  <wp:extent cx="4526280" cy="3890860"/>
+                  <wp:docPr id="2" name="Picture 2"/>
                   <wp:cNvGraphicFramePr>
                     <a:graphicFrameLocks noChangeAspect="1"/>
                   </wp:cNvGraphicFramePr>
@@ -948,7 +1003,7 @@
                           <pic:cNvPicPr/>
                         </pic:nvPicPr>
                         <pic:blipFill>
-                          <a:blip r:embed="rId9"/>
+                          <a:blip r:embed="rId10"/>
                           <a:stretch>
                             <a:fillRect/>
                           </a:stretch>
@@ -956,7 +1011,7 @@
                         <pic:spPr>
                           <a:xfrm>
                             <a:off x="0" y="0"/>
-                            <a:ext cx="4754880" cy="1093622"/>
+                            <a:ext cx="4526280" cy="3890860"/>
                           </a:xfrm>
                           <a:prstGeom prst="rect"/>
                         </pic:spPr>
@@ -974,9 +1029,10 @@
             </w:pPr>
             <w:r>
               <w:rPr>
+                <w:rFonts w:ascii="Arial" w:hAnsi="Arial"/>
                 <w:i/>
                 <w:color w:val="5A5A5A"/>
-                <w:sz w:val="16"/>
+                <w:sz w:val="17"/>
               </w:rPr>
               <w:t>Figura 1: Diagrama de Arquitectura de Componentes de Academia Lumina AI</w:t>
             </w:r>
@@ -1058,6 +1114,7 @@
             </w:pPr>
             <w:r>
               <w:rPr>
+                <w:rFonts w:ascii="Arial" w:hAnsi="Arial"/>
                 <w:b/>
                 <w:color w:val="8C4614"/>
                 <w:sz w:val="20"/>
@@ -1071,6 +1128,7 @@
             </w:pPr>
             <w:r>
               <w:rPr>
+                <w:rFonts w:ascii="Arial" w:hAnsi="Arial"/>
                 <w:sz w:val="18"/>
               </w:rPr>
               <w:t>•  rag_service.py: Motor de búsqueda semántica y ensamblado de prompts institucionales para Groq LPU con fallback bilingüe tolerante a fallos.</w:t>
@@ -1082,6 +1140,7 @@
             </w:pPr>
             <w:r>
               <w:rPr>
+                <w:rFonts w:ascii="Arial" w:hAnsi="Arial"/>
                 <w:sz w:val="18"/>
               </w:rPr>
               <w:t>•  vector_store.py: Wrapper sobre ChromaDB; gestiona la colección persistente lumina_knowledge_base y consultas por similitud de cosenos.</w:t>
@@ -1093,6 +1152,7 @@
             </w:pPr>
             <w:r>
               <w:rPr>
+                <w:rFonts w:ascii="Arial" w:hAnsi="Arial"/>
                 <w:sz w:val="18"/>
               </w:rPr>
               <w:t>•  cache.py: Implementa ResponseCache en memoria con clave hash por idioma e intención y expiración TTL de 1 hora.</w:t>
@@ -1104,6 +1164,7 @@
             </w:pPr>
             <w:r>
               <w:rPr>
+                <w:rFonts w:ascii="Arial" w:hAnsi="Arial"/>
                 <w:sz w:val="18"/>
               </w:rPr>
               <w:t>•  connection_manager.py: Administrador en memoria de sockets abiertos para estudiantes y asesores; enruta eventos en tiempo real.</w:t>
@@ -1115,6 +1176,7 @@
             </w:pPr>
             <w:r>
               <w:rPr>
+                <w:rFonts w:ascii="Arial" w:hAnsi="Arial"/>
                 <w:sz w:val="18"/>
               </w:rPr>
               <w:t>•  guardrails.py: Filtro de ciberseguridad con normalización Unicode NFKD contra ataques de Prompt Injection y jailbreaks.</w:t>
@@ -1126,6 +1188,7 @@
             </w:pPr>
             <w:r>
               <w:rPr>
+                <w:rFonts w:ascii="Arial" w:hAnsi="Arial"/>
                 <w:sz w:val="18"/>
               </w:rPr>
               <w:t>•  auth.py: Servicio de autenticación administrativa con algoritmo Bcrypt y generación/validación de tokens JWT Bearer.</w:t>
@@ -1137,6 +1200,7 @@
             </w:pPr>
             <w:r>
               <w:rPr>
+                <w:rFonts w:ascii="Arial" w:hAnsi="Arial"/>
                 <w:sz w:val="18"/>
               </w:rPr>
               <w:t>•  repository.py: Patrón repositorio con operaciones CRUD y sentencia UPDATE atómica con rowcount para evitar colisiones de asignación.</w:t>
@@ -1148,6 +1212,7 @@
             </w:pPr>
             <w:r>
               <w:rPr>
+                <w:rFonts w:ascii="Arial" w:hAnsi="Arial"/>
                 <w:sz w:val="18"/>
               </w:rPr>
               <w:t>•  ingestion_service.py: Módulo de procesamiento documental con extracción de texto de archivos PDF/DOCX y fragmentación (chunking).</w:t>
@@ -1159,6 +1224,7 @@
             </w:pPr>
             <w:r>
               <w:rPr>
+                <w:rFonts w:ascii="Arial" w:hAnsi="Arial"/>
                 <w:sz w:val="18"/>
               </w:rPr>
               <w:t>•  cleanup_service.py: Demonio de fondo que purga conversaciones resueltas con más de 30 minutos de antigüedad.</w:t>
@@ -1170,6 +1236,7 @@
             </w:pPr>
             <w:r>
               <w:rPr>
+                <w:rFonts w:ascii="Arial" w:hAnsi="Arial"/>
                 <w:sz w:val="18"/>
               </w:rPr>
               <w:t>•  metrics_service.py: Agregador estadístico que computa resolución autónoma, tiempos SLA, CSAT y ahorro de tokens/costos.</w:t>
@@ -1263,6 +1330,7 @@
             </w:pPr>
             <w:r>
               <w:rPr>
+                <w:rFonts w:ascii="Arial" w:hAnsi="Arial"/>
                 <w:b/>
                 <w:color w:val="8C4614"/>
                 <w:sz w:val="20"/>
@@ -1276,6 +1344,7 @@
             </w:pPr>
             <w:r>
               <w:rPr>
+                <w:rFonts w:ascii="Arial" w:hAnsi="Arial"/>
                 <w:sz w:val="18"/>
               </w:rPr>
               <w:t>•  FastAPI (Python 3.12): Seleccionado por su soporte asíncrono nativo para WebSockets de alta concurrencia y validación estricta Pydantic v2.</w:t>
@@ -1287,6 +1356,7 @@
             </w:pPr>
             <w:r>
               <w:rPr>
+                <w:rFonts w:ascii="Arial" w:hAnsi="Arial"/>
                 <w:sz w:val="18"/>
               </w:rPr>
               <w:t>•  Groq LPU: Permite inferencia LLM en ~500ms, velocidad indispensable para evitar el abandono de prospectos en chat en vivo.</w:t>
@@ -1298,6 +1368,7 @@
             </w:pPr>
             <w:r>
               <w:rPr>
+                <w:rFonts w:ascii="Arial" w:hAnsi="Arial"/>
                 <w:sz w:val="18"/>
               </w:rPr>
               <w:t>•  ChromaDB: Almacén vectorial embebido, ligero y libre de costos mensuales recurrentes de infraestructura externa.</w:t>
@@ -1309,6 +1380,7 @@
             </w:pPr>
             <w:r>
               <w:rPr>
+                <w:rFonts w:ascii="Arial" w:hAnsi="Arial"/>
                 <w:sz w:val="18"/>
               </w:rPr>
               <w:t>•  SQLAlchemy 2.0: Permite desacoplar el motor relacional, facilitando desarrollo local en SQLite y despliegue en PostgreSQL.</w:t>
@@ -1320,6 +1392,7 @@
             </w:pPr>
             <w:r>
               <w:rPr>
+                <w:rFonts w:ascii="Arial" w:hAnsi="Arial"/>
                 <w:sz w:val="18"/>
               </w:rPr>
               <w:t>•  React 18 + Tailwind v4: Compilación ultrarrápida con Vite 5 (~2.8s) y experiencia visual responsiva accesible y moderna.</w:t>
@@ -1331,6 +1404,7 @@
             </w:pPr>
             <w:r>
               <w:rPr>
+                <w:rFonts w:ascii="Arial" w:hAnsi="Arial"/>
                 <w:sz w:val="18"/>
               </w:rPr>
               <w:t>•  n8n Engine: Automatización flexible de webhooks y cron jobs hacia Telegram sin ensuciar la lógica de negocio del backend.</w:t>
@@ -1481,6 +1555,7 @@
             </w:pPr>
             <w:r>
               <w:rPr>
+                <w:rFonts w:ascii="Arial" w:hAnsi="Arial"/>
                 <w:b/>
                 <w:color w:val="8C4614"/>
                 <w:sz w:val="20"/>
@@ -1494,6 +1569,7 @@
             </w:pPr>
             <w:r>
               <w:rPr>
+                <w:rFonts w:ascii="Arial" w:hAnsi="Arial"/>
                 <w:color w:val="1E1E1E"/>
                 <w:sz w:val="18"/>
               </w:rPr>
@@ -1508,8 +1584,8 @@
             <w:r>
               <w:drawing>
                 <wp:inline xmlns:a="http://schemas.openxmlformats.org/drawingml/2006/main" xmlns:pic="http://schemas.openxmlformats.org/drawingml/2006/picture">
-                  <wp:extent cx="4754880" cy="6992471"/>
-                  <wp:docPr id="2" name="Picture 2"/>
+                  <wp:extent cx="4526280" cy="3177100"/>
+                  <wp:docPr id="3" name="Picture 3"/>
                   <wp:cNvGraphicFramePr>
                     <a:graphicFrameLocks noChangeAspect="1"/>
                   </wp:cNvGraphicFramePr>
@@ -1521,7 +1597,7 @@
                           <pic:cNvPicPr/>
                         </pic:nvPicPr>
                         <pic:blipFill>
-                          <a:blip r:embed="rId10"/>
+                          <a:blip r:embed="rId11"/>
                           <a:stretch>
                             <a:fillRect/>
                           </a:stretch>
@@ -1529,7 +1605,7 @@
                         <pic:spPr>
                           <a:xfrm>
                             <a:off x="0" y="0"/>
-                            <a:ext cx="4754880" cy="6992471"/>
+                            <a:ext cx="4526280" cy="3177100"/>
                           </a:xfrm>
                           <a:prstGeom prst="rect"/>
                         </pic:spPr>
@@ -1547,11 +1623,12 @@
             </w:pPr>
             <w:r>
               <w:rPr>
+                <w:rFonts w:ascii="Arial" w:hAnsi="Arial"/>
                 <w:i/>
                 <w:color w:val="5A5A5A"/>
-                <w:sz w:val="16"/>
-              </w:rPr>
-              <w:t>Figura 2: Diagrama UML de Casos de Uso del Sistema</w:t>
+                <w:sz w:val="17"/>
+              </w:rPr>
+              <w:t>Figura 2: Diagrama UML Formal de Casos de Uso del Sistema</w:t>
             </w:r>
           </w:p>
         </w:tc>
@@ -1631,6 +1708,7 @@
             </w:pPr>
             <w:r>
               <w:rPr>
+                <w:rFonts w:ascii="Arial" w:hAnsi="Arial"/>
                 <w:b/>
                 <w:color w:val="8C4614"/>
                 <w:sz w:val="20"/>
@@ -1644,6 +1722,7 @@
             </w:pPr>
             <w:r>
               <w:rPr>
+                <w:rFonts w:ascii="Arial" w:hAnsi="Arial"/>
                 <w:color w:val="1E1E1E"/>
                 <w:sz w:val="18"/>
               </w:rPr>
@@ -1658,8 +1737,8 @@
             <w:r>
               <w:drawing>
                 <wp:inline xmlns:a="http://schemas.openxmlformats.org/drawingml/2006/main" xmlns:pic="http://schemas.openxmlformats.org/drawingml/2006/picture">
-                  <wp:extent cx="4754880" cy="3432429"/>
-                  <wp:docPr id="3" name="Picture 3"/>
+                  <wp:extent cx="4526280" cy="2302310"/>
+                  <wp:docPr id="4" name="Picture 4"/>
                   <wp:cNvGraphicFramePr>
                     <a:graphicFrameLocks noChangeAspect="1"/>
                   </wp:cNvGraphicFramePr>
@@ -1671,7 +1750,7 @@
                           <pic:cNvPicPr/>
                         </pic:nvPicPr>
                         <pic:blipFill>
-                          <a:blip r:embed="rId11"/>
+                          <a:blip r:embed="rId12"/>
                           <a:stretch>
                             <a:fillRect/>
                           </a:stretch>
@@ -1679,7 +1758,7 @@
                         <pic:spPr>
                           <a:xfrm>
                             <a:off x="0" y="0"/>
-                            <a:ext cx="4754880" cy="3432429"/>
+                            <a:ext cx="4526280" cy="2302310"/>
                           </a:xfrm>
                           <a:prstGeom prst="rect"/>
                         </pic:spPr>
@@ -1697,9 +1776,10 @@
             </w:pPr>
             <w:r>
               <w:rPr>
+                <w:rFonts w:ascii="Arial" w:hAnsi="Arial"/>
                 <w:i/>
                 <w:color w:val="5A5A5A"/>
-                <w:sz w:val="16"/>
+                <w:sz w:val="17"/>
               </w:rPr>
               <w:t>Figura 3: Diagrama de Clases UML del Backend</w:t>
             </w:r>
@@ -1781,6 +1861,7 @@
             </w:pPr>
             <w:r>
               <w:rPr>
+                <w:rFonts w:ascii="Arial" w:hAnsi="Arial"/>
                 <w:b/>
                 <w:color w:val="8C4614"/>
                 <w:sz w:val="20"/>
@@ -1794,6 +1875,7 @@
             </w:pPr>
             <w:r>
               <w:rPr>
+                <w:rFonts w:ascii="Arial" w:hAnsi="Arial"/>
                 <w:color w:val="1E1E1E"/>
                 <w:sz w:val="18"/>
               </w:rPr>
@@ -1808,8 +1890,8 @@
             <w:r>
               <w:drawing>
                 <wp:inline xmlns:a="http://schemas.openxmlformats.org/drawingml/2006/main" xmlns:pic="http://schemas.openxmlformats.org/drawingml/2006/picture">
-                  <wp:extent cx="4754880" cy="2422017"/>
-                  <wp:docPr id="4" name="Picture 4"/>
+                  <wp:extent cx="4526280" cy="3607445"/>
+                  <wp:docPr id="5" name="Picture 5"/>
                   <wp:cNvGraphicFramePr>
                     <a:graphicFrameLocks noChangeAspect="1"/>
                   </wp:cNvGraphicFramePr>
@@ -1821,7 +1903,7 @@
                           <pic:cNvPicPr/>
                         </pic:nvPicPr>
                         <pic:blipFill>
-                          <a:blip r:embed="rId12"/>
+                          <a:blip r:embed="rId13"/>
                           <a:stretch>
                             <a:fillRect/>
                           </a:stretch>
@@ -1829,7 +1911,7 @@
                         <pic:spPr>
                           <a:xfrm>
                             <a:off x="0" y="0"/>
-                            <a:ext cx="4754880" cy="2422017"/>
+                            <a:ext cx="4526280" cy="3607445"/>
                           </a:xfrm>
                           <a:prstGeom prst="rect"/>
                         </pic:spPr>
@@ -1847,9 +1929,10 @@
             </w:pPr>
             <w:r>
               <w:rPr>
+                <w:rFonts w:ascii="Arial" w:hAnsi="Arial"/>
                 <w:i/>
                 <w:color w:val="5A5A5A"/>
-                <w:sz w:val="16"/>
+                <w:sz w:val="17"/>
               </w:rPr>
               <w:t>Figura 4: Diagrama de Secuencia - Consulta RAG y Caché Semántica</w:t>
             </w:r>
@@ -1862,8 +1945,8 @@
             <w:r>
               <w:drawing>
                 <wp:inline xmlns:a="http://schemas.openxmlformats.org/drawingml/2006/main" xmlns:pic="http://schemas.openxmlformats.org/drawingml/2006/picture">
-                  <wp:extent cx="4754880" cy="2228850"/>
-                  <wp:docPr id="5" name="Picture 5"/>
+                  <wp:extent cx="4526280" cy="3417341"/>
+                  <wp:docPr id="6" name="Picture 6"/>
                   <wp:cNvGraphicFramePr>
                     <a:graphicFrameLocks noChangeAspect="1"/>
                   </wp:cNvGraphicFramePr>
@@ -1875,7 +1958,7 @@
                           <pic:cNvPicPr/>
                         </pic:nvPicPr>
                         <pic:blipFill>
-                          <a:blip r:embed="rId13"/>
+                          <a:blip r:embed="rId14"/>
                           <a:stretch>
                             <a:fillRect/>
                           </a:stretch>
@@ -1883,7 +1966,7 @@
                         <pic:spPr>
                           <a:xfrm>
                             <a:off x="0" y="0"/>
-                            <a:ext cx="4754880" cy="2228850"/>
+                            <a:ext cx="4526280" cy="3417341"/>
                           </a:xfrm>
                           <a:prstGeom prst="rect"/>
                         </pic:spPr>
@@ -1901,9 +1984,10 @@
             </w:pPr>
             <w:r>
               <w:rPr>
+                <w:rFonts w:ascii="Arial" w:hAnsi="Arial"/>
                 <w:i/>
                 <w:color w:val="5A5A5A"/>
-                <w:sz w:val="16"/>
+                <w:sz w:val="17"/>
               </w:rPr>
               <w:t>Figura 5: Diagrama de Secuencia - Escalamiento y Chat en Vivo (Live Handoff)</w:t>
             </w:r>
@@ -1998,6 +2082,7 @@
             </w:pPr>
             <w:r>
               <w:rPr>
+                <w:rFonts w:ascii="Arial" w:hAnsi="Arial"/>
                 <w:b/>
                 <w:color w:val="8C4614"/>
                 <w:sz w:val="20"/>
@@ -2011,6 +2096,7 @@
             </w:pPr>
             <w:r>
               <w:rPr>
+                <w:rFonts w:ascii="Arial" w:hAnsi="Arial"/>
                 <w:color w:val="1E1E1E"/>
                 <w:sz w:val="18"/>
               </w:rPr>
@@ -2025,8 +2111,8 @@
             <w:r>
               <w:drawing>
                 <wp:inline xmlns:a="http://schemas.openxmlformats.org/drawingml/2006/main" xmlns:pic="http://schemas.openxmlformats.org/drawingml/2006/picture">
-                  <wp:extent cx="4754880" cy="2971800"/>
-                  <wp:docPr id="6" name="Picture 6"/>
+                  <wp:extent cx="4526280" cy="2828925"/>
+                  <wp:docPr id="7" name="Picture 7"/>
                   <wp:cNvGraphicFramePr>
                     <a:graphicFrameLocks noChangeAspect="1"/>
                   </wp:cNvGraphicFramePr>
@@ -2038,7 +2124,7 @@
                           <pic:cNvPicPr/>
                         </pic:nvPicPr>
                         <pic:blipFill>
-                          <a:blip r:embed="rId14"/>
+                          <a:blip r:embed="rId15"/>
                           <a:stretch>
                             <a:fillRect/>
                           </a:stretch>
@@ -2046,7 +2132,7 @@
                         <pic:spPr>
                           <a:xfrm>
                             <a:off x="0" y="0"/>
-                            <a:ext cx="4754880" cy="2971800"/>
+                            <a:ext cx="4526280" cy="2828925"/>
                           </a:xfrm>
                           <a:prstGeom prst="rect"/>
                         </pic:spPr>
@@ -2064,9 +2150,10 @@
             </w:pPr>
             <w:r>
               <w:rPr>
+                <w:rFonts w:ascii="Arial" w:hAnsi="Arial"/>
                 <w:i/>
                 <w:color w:val="5A5A5A"/>
-                <w:sz w:val="16"/>
+                <w:sz w:val="17"/>
               </w:rPr>
               <w:t>Figura 6: Portal Principal de Academia Lumina</w:t>
             </w:r>
@@ -2079,8 +2166,8 @@
             <w:r>
               <w:drawing>
                 <wp:inline xmlns:a="http://schemas.openxmlformats.org/drawingml/2006/main" xmlns:pic="http://schemas.openxmlformats.org/drawingml/2006/picture">
-                  <wp:extent cx="4754880" cy="2971800"/>
-                  <wp:docPr id="7" name="Picture 7"/>
+                  <wp:extent cx="4526280" cy="2828925"/>
+                  <wp:docPr id="8" name="Picture 8"/>
                   <wp:cNvGraphicFramePr>
                     <a:graphicFrameLocks noChangeAspect="1"/>
                   </wp:cNvGraphicFramePr>
@@ -2092,7 +2179,7 @@
                           <pic:cNvPicPr/>
                         </pic:nvPicPr>
                         <pic:blipFill>
-                          <a:blip r:embed="rId15"/>
+                          <a:blip r:embed="rId16"/>
                           <a:stretch>
                             <a:fillRect/>
                           </a:stretch>
@@ -2100,7 +2187,7 @@
                         <pic:spPr>
                           <a:xfrm>
                             <a:off x="0" y="0"/>
-                            <a:ext cx="4754880" cy="2971800"/>
+                            <a:ext cx="4526280" cy="2828925"/>
                           </a:xfrm>
                           <a:prstGeom prst="rect"/>
                         </pic:spPr>
@@ -2118,9 +2205,10 @@
             </w:pPr>
             <w:r>
               <w:rPr>
+                <w:rFonts w:ascii="Arial" w:hAnsi="Arial"/>
                 <w:i/>
                 <w:color w:val="5A5A5A"/>
-                <w:sz w:val="16"/>
+                <w:sz w:val="17"/>
               </w:rPr>
               <w:t>Figura 7: Widget Conversacional Inteligente con Respuesta RAG Oficial</w:t>
             </w:r>
@@ -2180,6 +2268,7 @@
             </w:pPr>
             <w:r>
               <w:rPr>
+                <w:rFonts w:ascii="Arial" w:hAnsi="Arial"/>
                 <w:b/>
                 <w:color w:val="8C4614"/>
                 <w:sz w:val="20"/>
@@ -2193,6 +2282,7 @@
             </w:pPr>
             <w:r>
               <w:rPr>
+                <w:rFonts w:ascii="Arial" w:hAnsi="Arial"/>
                 <w:color w:val="1E1E1E"/>
                 <w:sz w:val="18"/>
               </w:rPr>
@@ -2207,8 +2297,8 @@
             <w:r>
               <w:drawing>
                 <wp:inline xmlns:a="http://schemas.openxmlformats.org/drawingml/2006/main" xmlns:pic="http://schemas.openxmlformats.org/drawingml/2006/picture">
-                  <wp:extent cx="4754880" cy="2971800"/>
-                  <wp:docPr id="8" name="Picture 8"/>
+                  <wp:extent cx="4526280" cy="2828925"/>
+                  <wp:docPr id="9" name="Picture 9"/>
                   <wp:cNvGraphicFramePr>
                     <a:graphicFrameLocks noChangeAspect="1"/>
                   </wp:cNvGraphicFramePr>
@@ -2220,7 +2310,7 @@
                           <pic:cNvPicPr/>
                         </pic:nvPicPr>
                         <pic:blipFill>
-                          <a:blip r:embed="rId16"/>
+                          <a:blip r:embed="rId17"/>
                           <a:stretch>
                             <a:fillRect/>
                           </a:stretch>
@@ -2228,7 +2318,7 @@
                         <pic:spPr>
                           <a:xfrm>
                             <a:off x="0" y="0"/>
-                            <a:ext cx="4754880" cy="2971800"/>
+                            <a:ext cx="4526280" cy="2828925"/>
                           </a:xfrm>
                           <a:prstGeom prst="rect"/>
                         </pic:spPr>
@@ -2246,9 +2336,10 @@
             </w:pPr>
             <w:r>
               <w:rPr>
+                <w:rFonts w:ascii="Arial" w:hAnsi="Arial"/>
                 <w:i/>
                 <w:color w:val="5A5A5A"/>
-                <w:sz w:val="16"/>
+                <w:sz w:val="17"/>
               </w:rPr>
               <w:t>Figura 8: Módulo de Gestión Documental e Indexación Vectorial RAG</w:t>
             </w:r>
@@ -2308,6 +2399,7 @@
             </w:pPr>
             <w:r>
               <w:rPr>
+                <w:rFonts w:ascii="Arial" w:hAnsi="Arial"/>
                 <w:b/>
                 <w:color w:val="8C4614"/>
                 <w:sz w:val="20"/>
@@ -2321,6 +2413,7 @@
             </w:pPr>
             <w:r>
               <w:rPr>
+                <w:rFonts w:ascii="Arial" w:hAnsi="Arial"/>
                 <w:color w:val="1E1E1E"/>
                 <w:sz w:val="18"/>
               </w:rPr>
@@ -2335,8 +2428,8 @@
             <w:r>
               <w:drawing>
                 <wp:inline xmlns:a="http://schemas.openxmlformats.org/drawingml/2006/main" xmlns:pic="http://schemas.openxmlformats.org/drawingml/2006/picture">
-                  <wp:extent cx="4754880" cy="2971800"/>
-                  <wp:docPr id="9" name="Picture 9"/>
+                  <wp:extent cx="4526280" cy="2828925"/>
+                  <wp:docPr id="10" name="Picture 10"/>
                   <wp:cNvGraphicFramePr>
                     <a:graphicFrameLocks noChangeAspect="1"/>
                   </wp:cNvGraphicFramePr>
@@ -2348,7 +2441,7 @@
                           <pic:cNvPicPr/>
                         </pic:nvPicPr>
                         <pic:blipFill>
-                          <a:blip r:embed="rId17"/>
+                          <a:blip r:embed="rId18"/>
                           <a:stretch>
                             <a:fillRect/>
                           </a:stretch>
@@ -2356,7 +2449,7 @@
                         <pic:spPr>
                           <a:xfrm>
                             <a:off x="0" y="0"/>
-                            <a:ext cx="4754880" cy="2971800"/>
+                            <a:ext cx="4526280" cy="2828925"/>
                           </a:xfrm>
                           <a:prstGeom prst="rect"/>
                         </pic:spPr>
@@ -2374,9 +2467,10 @@
             </w:pPr>
             <w:r>
               <w:rPr>
+                <w:rFonts w:ascii="Arial" w:hAnsi="Arial"/>
                 <w:i/>
                 <w:color w:val="5A5A5A"/>
-                <w:sz w:val="16"/>
+                <w:sz w:val="17"/>
               </w:rPr>
               <w:t>Figura 9: Consola de Gestión de Casos y Chat en Vivo para Asesores</w:t>
             </w:r>
@@ -2437,6 +2531,7 @@
             </w:pPr>
             <w:r>
               <w:rPr>
+                <w:rFonts w:ascii="Arial" w:hAnsi="Arial"/>
                 <w:b/>
                 <w:color w:val="8C4614"/>
                 <w:sz w:val="20"/>
@@ -2450,6 +2545,7 @@
             </w:pPr>
             <w:r>
               <w:rPr>
+                <w:rFonts w:ascii="Arial" w:hAnsi="Arial"/>
                 <w:color w:val="1E1E1E"/>
                 <w:sz w:val="18"/>
               </w:rPr>
@@ -2464,8 +2560,8 @@
             <w:r>
               <w:drawing>
                 <wp:inline xmlns:a="http://schemas.openxmlformats.org/drawingml/2006/main" xmlns:pic="http://schemas.openxmlformats.org/drawingml/2006/picture">
-                  <wp:extent cx="4754880" cy="2971800"/>
-                  <wp:docPr id="10" name="Picture 10"/>
+                  <wp:extent cx="4526280" cy="2828925"/>
+                  <wp:docPr id="11" name="Picture 11"/>
                   <wp:cNvGraphicFramePr>
                     <a:graphicFrameLocks noChangeAspect="1"/>
                   </wp:cNvGraphicFramePr>
@@ -2477,7 +2573,7 @@
                           <pic:cNvPicPr/>
                         </pic:nvPicPr>
                         <pic:blipFill>
-                          <a:blip r:embed="rId18"/>
+                          <a:blip r:embed="rId19"/>
                           <a:stretch>
                             <a:fillRect/>
                           </a:stretch>
@@ -2485,7 +2581,7 @@
                         <pic:spPr>
                           <a:xfrm>
                             <a:off x="0" y="0"/>
-                            <a:ext cx="4754880" cy="2971800"/>
+                            <a:ext cx="4526280" cy="2828925"/>
                           </a:xfrm>
                           <a:prstGeom prst="rect"/>
                         </pic:spPr>
@@ -2503,9 +2599,10 @@
             </w:pPr>
             <w:r>
               <w:rPr>
+                <w:rFonts w:ascii="Arial" w:hAnsi="Arial"/>
                 <w:i/>
                 <w:color w:val="5A5A5A"/>
-                <w:sz w:val="16"/>
+                <w:sz w:val="17"/>
               </w:rPr>
               <w:t>Figura 10: Formulario Seguro de Autenticación Administrativa</w:t>
             </w:r>
@@ -2600,6 +2697,7 @@
             </w:pPr>
             <w:r>
               <w:rPr>
+                <w:rFonts w:ascii="Arial" w:hAnsi="Arial"/>
                 <w:b/>
                 <w:color w:val="8C4614"/>
                 <w:sz w:val="20"/>
@@ -2613,31 +2711,34 @@
             </w:pPr>
             <w:r>
               <w:rPr>
-                <w:sz w:val="18"/>
-              </w:rPr>
-              <w:t>•  conversations: Almacena las sesiones de chat, idioma detectado, estado del ciclo de vida ('bot', 'pendiente', 'en_atencion', 'resuelto'), asesor asignado y marcas de tiempo.</w:t>
-            </w:r>
-          </w:p>
-          <w:p>
-            <w:pPr>
-              <w:spacing w:before="30" w:after="30"/>
-            </w:pPr>
-            <w:r>
-              <w:rPr>
-                <w:sz w:val="18"/>
-              </w:rPr>
-              <w:t>•  messages: Preserva el historial completo de mensajes asociados a cada conversación, identificando remitente ('user', 'bot', 'agent'), contenido y marca temporal.</w:t>
-            </w:r>
-          </w:p>
-          <w:p>
-            <w:pPr>
-              <w:spacing w:before="30" w:after="30"/>
-            </w:pPr>
-            <w:r>
-              <w:rPr>
-                <w:sz w:val="18"/>
-              </w:rPr>
-              <w:t>•  admin_users: Cuentas de asesores y supervisores con roles ('admin', 'asesor'), estado activo y hashes de contraseñas Bcrypt.</w:t>
+                <w:rFonts w:ascii="Arial" w:hAnsi="Arial"/>
+                <w:sz w:val="18"/>
+              </w:rPr>
+              <w:t>•  conversations: Almacena las sesiones de chat, idioma detectado, estado del ciclo de vida (bot, pendiente, en_atencion, resuelto), asesor asignado y marcas de tiempo.</w:t>
+            </w:r>
+          </w:p>
+          <w:p>
+            <w:pPr>
+              <w:spacing w:before="30" w:after="30"/>
+            </w:pPr>
+            <w:r>
+              <w:rPr>
+                <w:rFonts w:ascii="Arial" w:hAnsi="Arial"/>
+                <w:sz w:val="18"/>
+              </w:rPr>
+              <w:t>•  messages: Preserva el historial completo de mensajes asociados a cada conversación, identificando remitente (user, bot, agent), contenido y marca temporal.</w:t>
+            </w:r>
+          </w:p>
+          <w:p>
+            <w:pPr>
+              <w:spacing w:before="30" w:after="30"/>
+            </w:pPr>
+            <w:r>
+              <w:rPr>
+                <w:rFonts w:ascii="Arial" w:hAnsi="Arial"/>
+                <w:sz w:val="18"/>
+              </w:rPr>
+              <w:t>•  admin_users: Cuentas de asesores y supervisores con roles (admin, asesor), estado activo y hashes de contraseñas Bcrypt.</w:t>
             </w:r>
           </w:p>
           <w:p>
@@ -2648,8 +2749,8 @@
             <w:r>
               <w:drawing>
                 <wp:inline xmlns:a="http://schemas.openxmlformats.org/drawingml/2006/main" xmlns:pic="http://schemas.openxmlformats.org/drawingml/2006/picture">
-                  <wp:extent cx="4754880" cy="5126355"/>
-                  <wp:docPr id="11" name="Picture 11"/>
+                  <wp:extent cx="4526280" cy="2399871"/>
+                  <wp:docPr id="12" name="Picture 12"/>
                   <wp:cNvGraphicFramePr>
                     <a:graphicFrameLocks noChangeAspect="1"/>
                   </wp:cNvGraphicFramePr>
@@ -2661,7 +2762,7 @@
                           <pic:cNvPicPr/>
                         </pic:nvPicPr>
                         <pic:blipFill>
-                          <a:blip r:embed="rId19"/>
+                          <a:blip r:embed="rId20"/>
                           <a:stretch>
                             <a:fillRect/>
                           </a:stretch>
@@ -2669,7 +2770,7 @@
                         <pic:spPr>
                           <a:xfrm>
                             <a:off x="0" y="0"/>
-                            <a:ext cx="4754880" cy="5126355"/>
+                            <a:ext cx="4526280" cy="2399871"/>
                           </a:xfrm>
                           <a:prstGeom prst="rect"/>
                         </pic:spPr>
@@ -2687,9 +2788,10 @@
             </w:pPr>
             <w:r>
               <w:rPr>
+                <w:rFonts w:ascii="Arial" w:hAnsi="Arial"/>
                 <w:i/>
                 <w:color w:val="5A5A5A"/>
-                <w:sz w:val="16"/>
+                <w:sz w:val="17"/>
               </w:rPr>
               <w:t>Figura 11: Diagrama Entidad-Relación (ER) de la Base de Datos</w:t>
             </w:r>
@@ -2749,6 +2851,7 @@
             </w:pPr>
             <w:r>
               <w:rPr>
+                <w:rFonts w:ascii="Arial" w:hAnsi="Arial"/>
                 <w:b/>
                 <w:color w:val="8C4614"/>
                 <w:sz w:val="20"/>
@@ -2762,6 +2865,7 @@
             </w:pPr>
             <w:r>
               <w:rPr>
+                <w:rFonts w:ascii="Arial" w:hAnsi="Arial"/>
                 <w:sz w:val="18"/>
               </w:rPr>
               <w:t>•  conversations: id (INT, PK, Auto), session_id (VARCHAR(100), Unique, Index), idioma (VARCHAR(10)), estado (VARCHAR(30), Index), agente_asignado (VARCHAR(100), Nullable), created_at (DATETIME), updated_at (DATETIME).</w:t>
@@ -2773,6 +2877,7 @@
             </w:pPr>
             <w:r>
               <w:rPr>
+                <w:rFonts w:ascii="Arial" w:hAnsi="Arial"/>
                 <w:sz w:val="18"/>
               </w:rPr>
               <w:t>•  messages: id (INT, PK, Auto), conversation_id (INT, FK), remitente (VARCHAR(20)), contenido (TEXT), sender_username (VARCHAR(50), Nullable), timestamp (DATETIME).</w:t>
@@ -2784,6 +2889,7 @@
             </w:pPr>
             <w:r>
               <w:rPr>
+                <w:rFonts w:ascii="Arial" w:hAnsi="Arial"/>
                 <w:sz w:val="18"/>
               </w:rPr>
               <w:t>•  admin_users: id (INT, PK, Auto), username (VARCHAR(50), Unique, Index), full_name (VARCHAR(100)), role (VARCHAR(20)), is_active (BOOLEAN), password_hash (VARCHAR(255)), created_at (DATETIME), updated_at (DATETIME).</w:t>
@@ -2844,6 +2950,7 @@
             </w:pPr>
             <w:r>
               <w:rPr>
+                <w:rFonts w:ascii="Arial" w:hAnsi="Arial"/>
                 <w:b/>
                 <w:color w:val="8C4614"/>
                 <w:sz w:val="20"/>
@@ -2857,6 +2964,7 @@
             </w:pPr>
             <w:r>
               <w:rPr>
+                <w:rFonts w:ascii="Arial" w:hAnsi="Arial"/>
                 <w:sz w:val="18"/>
               </w:rPr>
               <w:t>•  Llaves Primarias (PK): conversations.id, messages.id, admin_users.id (claves subrogadas enteras autoincrementales optimizadas para indexación B-Tree).</w:t>
@@ -2868,6 +2976,7 @@
             </w:pPr>
             <w:r>
               <w:rPr>
+                <w:rFonts w:ascii="Arial" w:hAnsi="Arial"/>
                 <w:sz w:val="18"/>
               </w:rPr>
               <w:t>•  Llave Foránea (FK): messages.conversation_id referencia a conversations.id.</w:t>
@@ -2879,6 +2988,7 @@
             </w:pPr>
             <w:r>
               <w:rPr>
+                <w:rFonts w:ascii="Arial" w:hAnsi="Arial"/>
                 <w:sz w:val="18"/>
               </w:rPr>
               <w:t>•  Regla de Integridad Referencial: ON DELETE CASCADE activada en messages.conversation_id para garantizar que al eliminarse o purgarse una conversación se remuevan automáticamente todos sus mensajes.</w:t>
@@ -2890,6 +3000,7 @@
             </w:pPr>
             <w:r>
               <w:rPr>
+                <w:rFonts w:ascii="Arial" w:hAnsi="Arial"/>
                 <w:sz w:val="18"/>
               </w:rPr>
               <w:t>•  Restricciones Únicas (UK): conversations.session_id (UUID de sesión web) y admin_users.username.</w:t>
@@ -2950,6 +3061,7 @@
             </w:pPr>
             <w:r>
               <w:rPr>
+                <w:rFonts w:ascii="Arial" w:hAnsi="Arial"/>
                 <w:b/>
                 <w:color w:val="8C4614"/>
                 <w:sz w:val="20"/>
@@ -2963,6 +3075,7 @@
             </w:pPr>
             <w:r>
               <w:rPr>
+                <w:rFonts w:ascii="Arial" w:hAnsi="Arial"/>
                 <w:sz w:val="18"/>
               </w:rPr>
               <w:t>•  Relación conversations - messages (1 : N): Una conversación agrupa múltiples mensajes ordenados cronológicamente por marca temporal. Un mensaje pertenece estrictamente a una única conversación.</w:t>
@@ -2974,9 +3087,10 @@
             </w:pPr>
             <w:r>
               <w:rPr>
-                <w:sz w:val="18"/>
-              </w:rPr>
-              <w:t>•  Ciclo de Vida de Persistencia: El hilo de segundo plano CleanupService ejecuta periódicamente la consulta: DELETE FROM conversations WHERE estado = 'resuelto' AND updated_at &lt;= NOW() - 30 MIN. Gracias al borrado en cascada, la tabla messages se mantiene optimizada y libre de registros huérfanos.</w:t>
+                <w:rFonts w:ascii="Arial" w:hAnsi="Arial"/>
+                <w:sz w:val="18"/>
+              </w:rPr>
+              <w:t>•  Ciclo de Vida de Persistencia: El hilo de segundo plano CleanupService ejecuta periódicamente la consulta: DELETE FROM conversations WHERE estado = resuelto AND updated_at &lt;= NOW() - 30 MIN. Gracias al borrado en cascada, la tabla messages se mantiene optimizada y libre de registros huérfanos.</w:t>
             </w:r>
           </w:p>
         </w:tc>
@@ -3002,41 +3116,109 @@
     </w:p>
     <w:p>
       <w:pPr>
-        <w:spacing w:after="0" w:line="240" w:lineRule="auto"/>
+        <w:spacing w:after="40" w:line="240" w:lineRule="auto" w:before="120"/>
         <w:rPr>
           <w:rFonts w:ascii="Arial" w:eastAsia="Times New Roman" w:hAnsi="Arial" w:cs="Arial"/>
           <w:b/>
           <w:lang w:eastAsia="es-CO"/>
         </w:rPr>
       </w:pPr>
+      <w:r/>
       <w:r>
-        <w:t>Firma: Breyner De Jesus Manga Arias</w:t>
+        <w:rPr>
+          <w:rFonts w:ascii="Arial" w:hAnsi="Arial"/>
+          <w:b/>
+          <w:sz w:val="20"/>
+        </w:rPr>
+        <w:t xml:space="preserve">Firma:  </w:t>
+      </w:r>
+      <w:r>
+        <w:drawing>
+          <wp:inline xmlns:a="http://schemas.openxmlformats.org/drawingml/2006/main" xmlns:pic="http://schemas.openxmlformats.org/drawingml/2006/picture">
+            <wp:extent cx="1280160" cy="750953"/>
+            <wp:docPr id="1" name="Picture 1"/>
+            <wp:cNvGraphicFramePr>
+              <a:graphicFrameLocks noChangeAspect="1"/>
+            </wp:cNvGraphicFramePr>
+            <a:graphic>
+              <a:graphicData uri="http://schemas.openxmlformats.org/drawingml/2006/picture">
+                <pic:pic>
+                  <pic:nvPicPr>
+                    <pic:cNvPr id="0" name="firma_limpia.png"/>
+                    <pic:cNvPicPr/>
+                  </pic:nvPicPr>
+                  <pic:blipFill>
+                    <a:blip r:embed="rId9"/>
+                    <a:stretch>
+                      <a:fillRect/>
+                    </a:stretch>
+                  </pic:blipFill>
+                  <pic:spPr>
+                    <a:xfrm>
+                      <a:off x="0" y="0"/>
+                      <a:ext cx="1280160" cy="750953"/>
+                    </a:xfrm>
+                    <a:prstGeom prst="rect"/>
+                  </pic:spPr>
+                </pic:pic>
+              </a:graphicData>
+            </a:graphic>
+          </wp:inline>
+        </w:drawing>
       </w:r>
     </w:p>
     <w:p>
       <w:pPr>
-        <w:spacing w:after="0" w:line="240" w:lineRule="auto"/>
+        <w:spacing w:after="40" w:line="240" w:lineRule="auto" w:before="80"/>
         <w:rPr>
           <w:rFonts w:ascii="Arial" w:eastAsia="Times New Roman" w:hAnsi="Arial" w:cs="Arial"/>
           <w:b/>
           <w:lang w:eastAsia="es-CO"/>
         </w:rPr>
       </w:pPr>
+      <w:r/>
       <w:r>
-        <w:t>Nombres y Apellidos del candidato: Breyner De Jesus Manga Arias</w:t>
+        <w:rPr>
+          <w:rFonts w:ascii="Arial" w:hAnsi="Arial"/>
+          <w:b/>
+          <w:sz w:val="20"/>
+        </w:rPr>
+        <w:t xml:space="preserve">Nombres y Apellidos del candidato: </w:t>
+      </w:r>
+      <w:r>
+        <w:rPr>
+          <w:rFonts w:ascii="Arial" w:hAnsi="Arial"/>
+          <w:b w:val="0"/>
+          <w:sz w:val="20"/>
+        </w:rPr>
+        <w:t>Breyner De Jesus Manga Arias</w:t>
       </w:r>
     </w:p>
     <w:p>
       <w:pPr>
-        <w:spacing w:after="0" w:line="240" w:lineRule="auto"/>
+        <w:spacing w:after="80" w:line="240" w:lineRule="auto" w:before="40"/>
         <w:rPr>
           <w:rFonts w:ascii="Arial" w:eastAsia="Times New Roman" w:hAnsi="Arial" w:cs="Arial"/>
           <w:b/>
           <w:lang w:eastAsia="es-CO"/>
         </w:rPr>
       </w:pPr>
+      <w:r/>
       <w:r>
-        <w:t>Documento: 1043668249</w:t>
+        <w:rPr>
+          <w:rFonts w:ascii="Arial" w:hAnsi="Arial"/>
+          <w:b/>
+          <w:sz w:val="20"/>
+        </w:rPr>
+        <w:t xml:space="preserve">Documento: </w:t>
+      </w:r>
+      <w:r>
+        <w:rPr>
+          <w:rFonts w:ascii="Arial" w:hAnsi="Arial"/>
+          <w:b w:val="0"/>
+          <w:sz w:val="20"/>
+        </w:rPr>
+        <w:t>1043668249</w:t>
       </w:r>
     </w:p>
     <w:p>

</xml_diff>